<commit_message>
docs(viz): complete comprehensive figure, table, and visual design overhaul with vector SVGs and publication PDF
</commit_message>
<xml_diff>
--- a/research_paper/FinFusionNet_Research_Paper.docx
+++ b/research_paper/FinFusionNet_Research_Paper.docx
@@ -80,6 +80,15 @@
 3. **Survivorship Bias**: Conditioning stock universes on contemporary index constituents, omitting historical deletions.
 4. **Benchmark Asymmetry**: Comparing sophisticated neural estimators against misaligned or unfairly parameterized baselines.
 5. **Distribution Distortions in Missing Data**: Artificially imputing days with no news as "neutral sentiment," corrupting the true conditional probability distribution of news arrival.</w:t>
+      </w:r>
+    </w:p>
+    <w:p>
+      <w:pPr>
+        <w:jc w:val="both"/>
+      </w:pPr>
+      <w:r>
+        <w:t>![Figure 1: End-to-End FinFusionNet Research Architecture and Audit Methodology](figures/methodology.png)
+*Figure 1: End-to-End FinFusionNet Research Architecture and Audit Methodology, illustrating multi-stream causal ingestion, Protocol B expanding walk-forward engine, dual-task CrossAttentionNet architecture, and audited hypothesis testing suite.*</w:t>
       </w:r>
     </w:p>
     <w:p>
@@ -384,6 +393,15 @@
                                  | Model forms forecast at 15:30 IST
                                  | Predicts: Direction &amp; Volatility of t+1
 ```</w:t>
+      </w:r>
+    </w:p>
+    <w:p>
+      <w:pPr>
+        <w:jc w:val="both"/>
+      </w:pPr>
+      <w:r>
+        <w:t>![Figure 2: 15:30 IST Causal Information Boundary and News Window Temporal Alignment](figures/temporal_alignment.png)
+*Figure 2: The 15:30 IST Causal Information Boundary. Any news article published during trading hours up to 15:30 IST is assigned to the current session's feature basket $\mathcal{W}_t$. Articles published post-15:30 are strictly shifted to session $t+1$ to eliminate lookahead bias.*</w:t>
       </w:r>
     </w:p>
     <w:p>
@@ -547,6 +565,15 @@
         <w:t>4. **Sentiment Features (8 FinBERT / 5 VADER Features)**:
    - *VADER*: Mean compound score, positive score, negative score, neutral score, and compound dispersion.
    - *FinBERT*: Mean positive softmax probability, negative probability, neutral probability, directional sentiment score ($P(\text{pos}) - P(\text{neg})$), article-level standard deviation (dispersion), and mean confidence ($\max(P)$).</w:t>
+      </w:r>
+    </w:p>
+    <w:p>
+      <w:pPr>
+        <w:jc w:val="both"/>
+      </w:pPr>
+      <w:r>
+        <w:t>![Figure 5: Empirical News Arrival Sparsity and FinBERT Sentiment Distribution](figures/news_distribution.png)
+*Figure 5: Empirical News Dynamics in the Common Evaluation Cohort. Panel A shows news coverage sparsity across the 45,136 ticker-day observations (72.5% active news days, 27.5% missing-news days). Panel B displays the empirical distribution of daily FinBERT sentiment scores ($P(\text{pos}) - P(\text{neg})$) on active news days, centered near zero with standard deviation 0.3817.*</w:t>
       </w:r>
     </w:p>
     <w:p>
@@ -874,6 +901,15 @@
         <w:jc w:val="both"/>
       </w:pPr>
       <w:r>
+        <w:t>![Figure 3: CrossAttentionNet Dual-Head Multimodal Architecture](figures/architecture.png)
+*Figure 3: Detailed neural network schematic of CrossAttentionNet, highlighting the 2-layer BiLSTM price encoder, linear news projection, multi-head temporal cross-attention with sentinel token masking, temporal fusion pooling, and dual prediction heads.*</w:t>
+      </w:r>
+    </w:p>
+    <w:p>
+      <w:pPr>
+        <w:jc w:val="both"/>
+      </w:pPr>
+      <w:r>
         <w:t>#</w:t>
       </w:r>
     </w:p>
@@ -958,6 +994,15 @@
 ...
 Fold 45: [ Train: 2021-01 to 2026-08 ]-[Embargo]-[ Test: 2026-09 ]
 ```</w:t>
+      </w:r>
+    </w:p>
+    <w:p>
+      <w:pPr>
+        <w:jc w:val="both"/>
+      </w:pPr>
+      <w:r>
+        <w:t>![Figure 4: Protocol B Walk-Forward Expanding Validation Engine](figures/walk_forward_protocol.png)
+*Figure 4: Protocol B Expanding Walk-Forward Validation Engine. Displaying the expanding training windows (from 24 to 68 months), the 1-session embargo gap, and the 45 monthly out-of-sample evaluation test folds spanning January 2023 through September 2026.*</w:t>
       </w:r>
     </w:p>
     <w:p>
@@ -1091,6 +1136,15 @@
         <w:jc w:val="both"/>
       </w:pPr>
       <w:r>
+        <w:t>![Figure 6: Direction Classification Performance and Probability Calibration Contrast](figures/classification_results.png)
+*Figure 6: Out-of-Sample Direction Classification Benchmark. Panel A presents date-level direction accuracy with 95% date-block bootstrap confidence intervals across all evaluated models and baselines. Panel B displays the ROC-AUC versus Brier Score scatter, illustrating that Cross-Attention Net achieves well-calibrated probabilities via base-rate shrinkage without achieving directional timing superiority.*</w:t>
+      </w:r>
+    </w:p>
+    <w:p>
+      <w:pPr>
+        <w:jc w:val="both"/>
+      </w:pPr>
+      <w:r>
         <w:t>#</w:t>
       </w:r>
     </w:p>
@@ -1165,6 +1219,15 @@
         <w:jc w:val="both"/>
       </w:pPr>
       <w:r>
+        <w:t>![Figure 7: Volatility Benchmarking and Overnight Jump Bias Resolution](figures/volatility_results.png)
+*Figure 7: Volatility Benchmarking and Asymmetry Resolution. Panel A illustrates the sample means of the true Parkinson high-low target (0.2024) versus trailing close-to-close volatility (0.2355), demonstrating the $+0.0331$ (+16.3%) overnight gap bias. Panel B evaluates RMSE and out-of-sample $R^2$ across fair Parkinson benchmarks (`parkinson_20`, `parkinson_10`, `parkinson_5`) versus Cross-Attention Net.*</w:t>
+      </w:r>
+    </w:p>
+    <w:p>
+      <w:pPr>
+        <w:jc w:val="both"/>
+      </w:pPr>
+      <w:r>
         <w:t>#</w:t>
       </w:r>
     </w:p>
@@ -1221,6 +1284,15 @@
       </w:pPr>
       <w:r>
         <w:t>---</w:t>
+      </w:r>
+    </w:p>
+    <w:p>
+      <w:pPr>
+        <w:jc w:val="both"/>
+      </w:pPr>
+      <w:r>
+        <w:t>![Figure 9: Model Direction Accuracy Across Market Volatility and Directional Regimes](figures/regime_analysis.png)
+*Figure 9: Model Fragility Across Market Regimes. Date-level direction accuracy across High Volatility (top 25%), Normal Volatility (middle 50%), Low Volatility (bottom 25%), Bull Sessions (index return $&gt; 0$), and Bear Sessions (index return $&lt; 0$). All models suffer severe degradation in high-volatility environments.*</w:t>
       </w:r>
     </w:p>
     <w:p/>
@@ -1263,6 +1335,15 @@
 | **LSTM-FinBERT vs LSTM-F0** | -0.0055 | [-0.0117, -0.0002] | 0.9800 | 385 vs 418 (Ties 113)| 0.2588 | -1.8802 | 0.0604 | -1.7991 | 0.0723 | 0.9800 | **False** |
 | **XGB-FinBERT vs XGB-F0** | +0.0015 | [-0.0116, +0.0129] | 0.4595 | 440 vs 439 (Ties 37) | 1.0000 | -12.4165 | $&lt; 10^{-15}$ | +0.2336 | 0.8153 | 1.0000 | **False** |
 | **LR-FinBERT vs LR-F0** | +0.0001 | [-0.0034, +0.0030] | 0.5445 | 371 vs 388 (Ties 157)| 0.5614 | -0.3954 | 0.6926 | +0.0679 | 0.9459 | 1.0000 | **False** |</w:t>
+      </w:r>
+    </w:p>
+    <w:p>
+      <w:pPr>
+        <w:jc w:val="both"/>
+      </w:pPr>
+      <w:r>
+        <w:t>![Figure 8: Diebold-Mariano Test Statistics and Significance Forest Plot](figures/statistical_results.png)
+*Figure 8: Forest Plot of Date-Level Diebold–Mariano Test Statistics for 0–1 Classification Loss across planned pairwise comparisons. Dashed lines indicate the 5% two-sided significance boundaries ($DM = \pm 1.96$). LSTM-F0 significantly outperforms Cross-Attention Net ($DM = -2.125, p = 0.0339$). Under family-wise Holm–Bonferroni correction, no sentiment model demonstrates positive alpha.*</w:t>
       </w:r>
     </w:p>
     <w:p>

</xml_diff>